<commit_message>
Doc 5 plain explainer: full-sentence bullets, APC standard
</commit_message>
<xml_diff>
--- a/APC-2026-Diamante-Doc5-Simple.docx
+++ b/APC-2026-Diamante-Doc5-Simple.docx
@@ -9,19 +9,17 @@
           <w:color w:val="1F3D6B"/>
           <w:sz w:val="30"/>
         </w:rPr>
-        <w:t>Document 5 explained simply — the new manager bonus scheme</w:t>
+        <w:t>Document 5 explained simply — the proposed new manager bonus scheme</w:t>
       </w:r>
     </w:p>
     <w:p>
-      <w:pPr>
-        <w:spacing w:after="160"/>
-      </w:pPr>
       <w:r>
         <w:rPr>
           <w:i/>
-          <w:sz w:val="22"/>
+          <w:color w:val="555555"/>
+          <w:sz w:val="21"/>
         </w:rPr>
-        <w:t>A plain-English note from me (the newly-qualified CA) to talk you through what Document 5 says and the main things worth thinking about — no jargon.</w:t>
+        <w:t>A plain-English note from me (the newly-qualified CA) walking you through Document 5 and the main points to consider.</w:t>
       </w:r>
     </w:p>
     <w:p>
@@ -34,19 +32,31 @@
           <w:color w:val="1F3D6B"/>
           <w:sz w:val="24"/>
         </w:rPr>
-        <w:t>What this email actually is</w:t>
+        <w:t>What this email is</w:t>
       </w:r>
     </w:p>
     <w:p>
       <w:pPr>
-        <w:spacing w:after="120"/>
+        <w:pStyle w:val="ListBullet"/>
+        <w:spacing w:after="80"/>
       </w:pPr>
       <w:r>
         <w:rPr>
-          <w:i w:val="0"/>
           <w:sz w:val="22"/>
         </w:rPr>
-        <w:t>Lavashni is a new independent director who has just taken over as head of the remuneration committee (the small group of directors that decides how senior managers get paid). She wasn’t at the last AGM but heard that people were unhappy about pay, so she’s checking she has understood the proposed new bonus scheme correctly.</w:t>
+        <w:t>Lavashni Govender is a newly appointed independent non-executive director who has just taken over as chair of the remuneration committee, which is the board committee responsible for deciding how senior management is paid.</w:t>
+      </w:r>
+    </w:p>
+    <w:p>
+      <w:pPr>
+        <w:pStyle w:val="ListBullet"/>
+        <w:spacing w:after="80"/>
+      </w:pPr>
+      <w:r>
+        <w:rPr>
+          <w:sz w:val="22"/>
+        </w:rPr>
+        <w:t>She did not attend the last AGM, but she understands that there was dissatisfaction from shareholders about remuneration, so she is writing to confirm that she has correctly understood the proposed new long-term incentive scheme.</w:t>
       </w:r>
     </w:p>
     <w:p>
@@ -59,67 +69,55 @@
           <w:color w:val="1F3D6B"/>
           <w:sz w:val="24"/>
         </w:rPr>
-        <w:t>How the proposed bonus would work (in simple terms)</w:t>
+        <w:t>How the proposed scheme would work</w:t>
       </w:r>
     </w:p>
     <w:p>
       <w:pPr>
         <w:pStyle w:val="ListBullet"/>
-        <w:spacing w:after="60"/>
+        <w:spacing w:after="80"/>
       </w:pPr>
       <w:r>
         <w:rPr>
-          <w:b/>
+          <w:sz w:val="22"/>
         </w:rPr>
-        <w:t xml:space="preserve">Managers get paid in shares, not cash. </w:t>
-      </w:r>
-      <w:r>
-        <w:t>They’d receive company shares as their bonus.</w:t>
+        <w:t>Under the proposal, senior managers would be rewarded with company shares rather than a cash bonus.</w:t>
       </w:r>
     </w:p>
     <w:p>
       <w:pPr>
         <w:pStyle w:val="ListBullet"/>
-        <w:spacing w:after="60"/>
+        <w:spacing w:after="80"/>
       </w:pPr>
       <w:r>
         <w:rPr>
-          <w:b/>
+          <w:sz w:val="22"/>
         </w:rPr>
-        <w:t xml:space="preserve">It’s a big number. </w:t>
-      </w:r>
-      <w:r>
-        <w:t>The value is 3 to 5 times their yearly salary.</w:t>
+        <w:t>The value of the award is significant, as it is set at between three and five times each manager’s annual salary.</w:t>
       </w:r>
     </w:p>
     <w:p>
       <w:pPr>
         <w:pStyle w:val="ListBullet"/>
-        <w:spacing w:after="60"/>
+        <w:spacing w:after="80"/>
       </w:pPr>
       <w:r>
         <w:rPr>
-          <w:b/>
+          <w:sz w:val="22"/>
         </w:rPr>
-        <w:t xml:space="preserve">The share count is only fixed later. </w:t>
-      </w:r>
-      <w:r>
-        <w:t>How many shares they get is worked out on the day the shares "vest" (become theirs), using the share price on that day.</w:t>
+        <w:t>The actual number of shares is only determined on the date the shares vest, based on the company’s share price on that date.</w:t>
       </w:r>
     </w:p>
     <w:p>
       <w:pPr>
         <w:pStyle w:val="ListBullet"/>
-        <w:spacing w:after="60"/>
+        <w:spacing w:after="80"/>
       </w:pPr>
       <w:r>
         <w:rPr>
-          <w:b/>
+          <w:sz w:val="22"/>
         </w:rPr>
-        <w:t xml:space="preserve">It’s paid out over 3 years. </w:t>
-      </w:r>
-      <w:r>
-        <w:t>The shares are handed over in stages over three years, and only if the performance targets (KPIs) are met each year.</w:t>
+        <w:t>The shares vest in stages over a three-year period, and only if the specified performance targets (KPIs) are achieved each year.</w:t>
       </w:r>
     </w:p>
     <w:p>
@@ -132,82 +130,67 @@
           <w:color w:val="1F3D6B"/>
           <w:sz w:val="24"/>
         </w:rPr>
-        <w:t>The 5 targets (KPIs), in plain English</w:t>
+        <w:t>The five KPIs, explained simply</w:t>
       </w:r>
     </w:p>
     <w:p>
       <w:pPr>
         <w:pStyle w:val="ListBullet"/>
-        <w:spacing w:after="60"/>
+        <w:spacing w:after="80"/>
       </w:pPr>
       <w:r>
         <w:rPr>
-          <w:b/>
+          <w:sz w:val="22"/>
         </w:rPr>
-        <w:t xml:space="preserve">1. Keep cost growth below inflation </w:t>
-      </w:r>
-      <w:r>
-        <w:t>— basically, don’t let mining costs run away.</w:t>
+        <w:t>KPI 1 rewards keeping the growth in mining costs (excluding impairments) below inflation, which is intended to encourage management to control costs.</w:t>
       </w:r>
     </w:p>
     <w:p>
       <w:pPr>
         <w:pStyle w:val="ListBullet"/>
-        <w:spacing w:after="60"/>
+        <w:spacing w:after="80"/>
       </w:pPr>
       <w:r>
         <w:rPr>
-          <w:b/>
+          <w:sz w:val="22"/>
         </w:rPr>
-        <w:t xml:space="preserve">2. Grow profit by at least 5% </w:t>
-      </w:r>
-      <w:r>
-        <w:t>— so shareholders benefit.</w:t>
+        <w:t>KPI 2 rewards growing net profit by at least 5%, which is meant to ensure that shareholders benefit from management’s performance.</w:t>
       </w:r>
     </w:p>
     <w:p>
       <w:pPr>
         <w:pStyle w:val="ListBullet"/>
-        <w:spacing w:after="60"/>
+        <w:spacing w:after="80"/>
       </w:pPr>
       <w:r>
         <w:rPr>
-          <w:b/>
+          <w:sz w:val="22"/>
         </w:rPr>
-        <w:t xml:space="preserve">3. Mine more high-value diamonds (as a % of total) </w:t>
-      </w:r>
-      <w:r>
-        <w:t>— rewards our "quality over quantity" strategy.</w:t>
+        <w:t>KPI 3 rewards mining a higher proportion of high-value diamonds, which supports the company’s "value-led" strategy of prioritising quality over quantity.</w:t>
       </w:r>
     </w:p>
     <w:p>
       <w:pPr>
         <w:pStyle w:val="ListBullet"/>
-        <w:spacing w:after="60"/>
+        <w:spacing w:after="80"/>
       </w:pPr>
       <w:r>
         <w:rPr>
-          <w:b/>
+          <w:sz w:val="22"/>
         </w:rPr>
-        <w:t xml:space="preserve">4. Reduce the amount of diamond stock we hold </w:t>
-      </w:r>
-      <w:r>
-        <w:t>— frees up cash.</w:t>
+        <w:t>KPI 4 rewards reducing the level of diamond inventory held, which is intended to free up cash for the business.</w:t>
       </w:r>
     </w:p>
     <w:p>
       <w:pPr>
         <w:pStyle w:val="ListBullet"/>
-        <w:spacing w:after="60"/>
+        <w:spacing w:after="80"/>
       </w:pPr>
       <w:r>
         <w:rPr>
-          <w:b/>
+          <w:sz w:val="22"/>
         </w:rPr>
-        <w:t xml:space="preserve">5. Get a top EY rating for our integrated report </w:t>
-      </w:r>
-      <w:r>
-        <w:t>— rewards good ESG and reporting.</w:t>
+        <w:t>KPI 5 rewards achieving a top EY rating for the company’s integrated report, which is intended to reflect strong ESG and reporting performance.</w:t>
       </w:r>
     </w:p>
     <w:p>
@@ -220,97 +203,79 @@
           <w:color w:val="1F3D6B"/>
           <w:sz w:val="24"/>
         </w:rPr>
-        <w:t>The main things I’d flag (kept simple)</w:t>
+        <w:t>The main points I would raise</w:t>
       </w:r>
     </w:p>
     <w:p>
       <w:pPr>
         <w:pStyle w:val="ListBullet"/>
-        <w:spacing w:after="60"/>
+        <w:spacing w:after="80"/>
       </w:pPr>
       <w:r>
         <w:rPr>
-          <w:b/>
+          <w:sz w:val="22"/>
         </w:rPr>
-        <w:t xml:space="preserve">Fairness looks off. </w:t>
-      </w:r>
-      <w:r>
-        <w:t>We paused bonuses for all other staff this year because money is tight, yet managers could still get shares worth 3–5× salary — in a year we made a big loss. That looks like "rewarding failure", which is probably why people were unhappy at the AGM.</w:t>
+        <w:t>The scheme raises a fairness concern, because bonuses were paused for all other staff this year due to financial pressure, yet management could still receive shares worth three to five times their salary in a year in which the company made a large loss, which looks like a "reward for failure" and is likely what drove the dissatisfaction at the AGM.</w:t>
       </w:r>
     </w:p>
     <w:p>
       <w:pPr>
         <w:pStyle w:val="ListBullet"/>
-        <w:spacing w:after="60"/>
+        <w:spacing w:after="80"/>
       </w:pPr>
       <w:r>
         <w:rPr>
-          <w:b/>
+          <w:sz w:val="22"/>
         </w:rPr>
-        <w:t xml:space="preserve">Target 2 doesn’t really work. </w:t>
-      </w:r>
-      <w:r>
-        <w:t>You can’t grow profit by 5% when the company is actually making a loss. To hit it, managers might be tempted to create profit on paper (for example by selling assets) instead of genuinely running the mines better.</w:t>
+        <w:t>KPI 2 is not realistic in the current circumstances, because the company is loss-making and it is not possible to grow profit by 5% when there is no profit to grow, which creates a risk that management focuses on creating profit on paper (for example through asset sales) rather than genuinely improving the performance of the mines.</w:t>
       </w:r>
     </w:p>
     <w:p>
       <w:pPr>
         <w:pStyle w:val="ListBullet"/>
-        <w:spacing w:after="60"/>
+        <w:spacing w:after="80"/>
       </w:pPr>
       <w:r>
         <w:rPr>
-          <w:b/>
+          <w:sz w:val="22"/>
         </w:rPr>
-        <w:t xml:space="preserve">Some targets can be "gamed". </w:t>
-      </w:r>
-      <w:r>
-        <w:t>You could reduce stock by selling diamonds cheaply in a weak market (something we normally avoid), or push up the "high-value %" by only mining the best areas and abandoning others. Each hits the target but hurts the business long-term.</w:t>
+        <w:t>Several of the KPIs can be achieved in ways that actually damage the business, for example reducing inventory by selling diamonds cheaply into a weak market (which contradicts our strategy of holding back sales when prices are low), or improving the high-value percentage by mining only the best areas and abandoning the rest.</w:t>
       </w:r>
     </w:p>
     <w:p>
       <w:pPr>
         <w:pStyle w:val="ListBullet"/>
-        <w:spacing w:after="60"/>
+        <w:spacing w:after="80"/>
       </w:pPr>
       <w:r>
         <w:rPr>
-          <w:b/>
+          <w:sz w:val="22"/>
         </w:rPr>
-        <w:t xml:space="preserve">Target 1 is almost already met. </w:t>
-      </w:r>
-      <w:r>
-        <w:t>Our costs already fell a lot this year, so managers could earn a bonus on this even though we made a loss.</w:t>
+        <w:t>KPI 1 has effectively already been met, because mining costs fell substantially this year, which means management could earn a bonus on this measure even though the company reported a loss.</w:t>
       </w:r>
     </w:p>
     <w:p>
       <w:pPr>
         <w:pStyle w:val="ListBullet"/>
-        <w:spacing w:after="60"/>
+        <w:spacing w:after="80"/>
       </w:pPr>
       <w:r>
         <w:rPr>
-          <w:b/>
+          <w:sz w:val="22"/>
         </w:rPr>
-        <w:t xml:space="preserve">Nothing rewards safety or the environment. </w:t>
-      </w:r>
-      <w:r>
-        <w:t>For a mining company that’s a big gap — these are exactly the things we don’t want managers cutting to hit a cost target.</w:t>
+        <w:t>The scheme contains no measures relating to safety or the environment, which is a significant gap for a mining company and is exactly the area we would not want managers to cut in order to hit a cost target.</w:t>
       </w:r>
     </w:p>
     <w:p>
       <w:pPr>
         <w:pStyle w:val="ListBullet"/>
-        <w:spacing w:after="60"/>
+        <w:spacing w:after="80"/>
       </w:pPr>
       <w:r>
         <w:rPr>
-          <w:b/>
+          <w:sz w:val="22"/>
         </w:rPr>
-        <w:t xml:space="preserve">Governance / the committee. </w:t>
-      </w:r>
-      <w:r>
-        <w:t>Lavashni is brand new, wasn’t at the AGM, says she isn’t fully sure about the KPIs, and is away for a week. As the person now in charge of pay decisions she’ll need to get properly up to speed, and we should make sure there are clear written rules, proper minutes, and that shareholders approve the scheme.</w:t>
+        <w:t>There are governance concerns around the committee itself, because Lavashni is newly appointed, did not attend the AGM, indicates that she is not fully familiar with the KPIs, and is away for a week, so as the person now responsible for pay decisions she will need to become properly informed, and the company should ensure there is a clear written remuneration policy, proper minutes of meetings, and shareholder approval of the scheme.</w:t>
       </w:r>
     </w:p>
     <w:p>
@@ -323,43 +288,43 @@
           <w:color w:val="1F3D6B"/>
           <w:sz w:val="24"/>
         </w:rPr>
-        <w:t>In one line</w:t>
+        <w:t>Overall</w:t>
       </w:r>
     </w:p>
     <w:p>
       <w:pPr>
-        <w:spacing w:after="120"/>
+        <w:pStyle w:val="ListBullet"/>
+        <w:spacing w:after="80"/>
       </w:pPr>
       <w:r>
         <w:rPr>
-          <w:i w:val="0"/>
           <w:sz w:val="22"/>
         </w:rPr>
-        <w:t>The basic idea — paying managers in shares over time so they focus on the long term — is fine. But the specific targets need work: some are unrealistic, some can be gamed, and the timing and fairness are sensitive while we’re fighting to survive and asking shareholders for more money through the rights issue.</w:t>
+        <w:t>In principle, the idea of paying management in shares that vest over time is sound, because it encourages a long-term focus rather than short-term decisions.</w:t>
       </w:r>
     </w:p>
     <w:p>
       <w:pPr>
-        <w:spacing w:after="40"/>
+        <w:pStyle w:val="ListBullet"/>
+        <w:spacing w:after="80"/>
       </w:pPr>
       <w:r>
         <w:rPr>
-          <w:i w:val="0"/>
           <w:sz w:val="22"/>
         </w:rPr>
-        <w:t>Happy to help redesign the targets into something fairer and more realistic if that’s useful.</w:t>
+        <w:t>However, the specific targets need to be reconsidered, because some are unrealistic, some can be manipulated, and the timing and fairness of the scheme are sensitive while the company is dependent on the refinancing and is asking shareholders for further funding through a rights issue.</w:t>
       </w:r>
     </w:p>
     <w:p>
       <w:pPr>
-        <w:spacing w:after="120"/>
+        <w:pStyle w:val="ListBullet"/>
+        <w:spacing w:after="80"/>
       </w:pPr>
       <w:r>
         <w:rPr>
-          <w:i/>
           <w:sz w:val="22"/>
         </w:rPr>
-        <w:t>— Newly-qualified CA(SA)</w:t>
+        <w:t>I would be happy to help redesign the targets into a fairer and more realistic set of measures if that would be useful.</w:t>
       </w:r>
     </w:p>
     <w:sectPr>

</xml_diff>